<commit_message>
Updated email function and multiple merges.
</commit_message>
<xml_diff>
--- a/project/documents/communications/incorrectrecordation.docx
+++ b/project/documents/communications/incorrectrecordation.docx
@@ -1,6 +1,6 @@
 
 <file path=word/document.xml><?xml version="1.0" encoding="utf-8"?>
-<w:document xmlns:wpc="http://schemas.microsoft.com/office/word/2010/wordprocessingCanvas" xmlns:cx="http://schemas.microsoft.com/office/drawing/2014/chartex" xmlns:cx1="http://schemas.microsoft.com/office/drawing/2015/9/8/chartex" xmlns:cx2="http://schemas.microsoft.com/office/drawing/2015/10/21/chartex" xmlns:cx3="http://schemas.microsoft.com/office/drawing/2016/5/9/chartex" xmlns:cx4="http://schemas.microsoft.com/office/drawing/2016/5/10/chartex" xmlns:cx5="http://schemas.microsoft.com/office/drawing/2016/5/11/chartex" xmlns:cx6="http://schemas.microsoft.com/office/drawing/2016/5/12/chartex" xmlns:cx7="http://schemas.microsoft.com/office/drawing/2016/5/13/chartex" xmlns:cx8="http://schemas.microsoft.com/office/drawing/2016/5/14/chartex" xmlns:mc="http://schemas.openxmlformats.org/markup-compatibility/2006" xmlns:aink="http://schemas.microsoft.com/office/drawing/2016/ink" xmlns:am3d="http://schemas.microsoft.com/office/drawing/2017/model3d" xmlns:o="urn:schemas-microsoft-com:office:office" xmlns:oel="http://schemas.microsoft.com/office/2019/extlst" xmlns:r="http://schemas.openxmlformats.org/officeDocument/2006/relationships" xmlns:m="http://schemas.openxmlformats.org/officeDocument/2006/math" xmlns:v="urn:schemas-microsoft-com:vml" xmlns:wp14="http://schemas.microsoft.com/office/word/2010/wordprocessingDrawing" xmlns:wp="http://schemas.openxmlformats.org/drawingml/2006/wordprocessingDrawing" xmlns:w10="urn:schemas-microsoft-com:office:word" xmlns:w="http://schemas.openxmlformats.org/wordprocessingml/2006/main" xmlns:w14="http://schemas.microsoft.com/office/word/2010/wordml" xmlns:w15="http://schemas.microsoft.com/office/word/2012/wordml" xmlns:w16cex="http://schemas.microsoft.com/office/word/2018/wordml/cex" xmlns:w16cid="http://schemas.microsoft.com/office/word/2016/wordml/cid" xmlns:w16="http://schemas.microsoft.com/office/word/2018/wordml" xmlns:w16sdtdh="http://schemas.microsoft.com/office/word/2020/wordml/sdtdatahash" xmlns:w16se="http://schemas.microsoft.com/office/word/2015/wordml/symex" xmlns:wpg="http://schemas.microsoft.com/office/word/2010/wordprocessingGroup" xmlns:wpi="http://schemas.microsoft.com/office/word/2010/wordprocessingInk" xmlns:wne="http://schemas.microsoft.com/office/word/2006/wordml" xmlns:wps="http://schemas.microsoft.com/office/word/2010/wordprocessingShape" mc:Ignorable="w14 w15 w16se w16cid w16 w16cex w16sdtdh wp14">
+<w:document xmlns:wpc="http://schemas.microsoft.com/office/word/2010/wordprocessingCanvas" xmlns:cx="http://schemas.microsoft.com/office/drawing/2014/chartex" xmlns:cx1="http://schemas.microsoft.com/office/drawing/2015/9/8/chartex" xmlns:cx2="http://schemas.microsoft.com/office/drawing/2015/10/21/chartex" xmlns:cx3="http://schemas.microsoft.com/office/drawing/2016/5/9/chartex" xmlns:cx4="http://schemas.microsoft.com/office/drawing/2016/5/10/chartex" xmlns:cx5="http://schemas.microsoft.com/office/drawing/2016/5/11/chartex" xmlns:cx6="http://schemas.microsoft.com/office/drawing/2016/5/12/chartex" xmlns:cx7="http://schemas.microsoft.com/office/drawing/2016/5/13/chartex" xmlns:cx8="http://schemas.microsoft.com/office/drawing/2016/5/14/chartex" xmlns:mc="http://schemas.openxmlformats.org/markup-compatibility/2006" xmlns:aink="http://schemas.microsoft.com/office/drawing/2016/ink" xmlns:am3d="http://schemas.microsoft.com/office/drawing/2017/model3d" xmlns:o="urn:schemas-microsoft-com:office:office" xmlns:oel="http://schemas.microsoft.com/office/2019/extlst" xmlns:r="http://schemas.openxmlformats.org/officeDocument/2006/relationships" xmlns:m="http://schemas.openxmlformats.org/officeDocument/2006/math" xmlns:v="urn:schemas-microsoft-com:vml" xmlns:wp14="http://schemas.microsoft.com/office/word/2010/wordprocessingDrawing" xmlns:wp="http://schemas.openxmlformats.org/drawingml/2006/wordprocessingDrawing" xmlns:w10="urn:schemas-microsoft-com:office:word" xmlns:w="http://schemas.openxmlformats.org/wordprocessingml/2006/main" xmlns:w14="http://schemas.microsoft.com/office/word/2010/wordml" xmlns:w15="http://schemas.microsoft.com/office/word/2012/wordml" xmlns:w16cex="http://schemas.microsoft.com/office/word/2018/wordml/cex" xmlns:w16cid="http://schemas.microsoft.com/office/word/2016/wordml/cid" xmlns:w16="http://schemas.microsoft.com/office/word/2018/wordml" xmlns:w16du="http://schemas.microsoft.com/office/word/2023/wordml/word16du" xmlns:w16sdtdh="http://schemas.microsoft.com/office/word/2020/wordml/sdtdatahash" xmlns:w16sdtfl="http://schemas.microsoft.com/office/word/2024/wordml/sdtformatlock" xmlns:w16se="http://schemas.microsoft.com/office/word/2015/wordml/symex" xmlns:wpg="http://schemas.microsoft.com/office/word/2010/wordprocessingGroup" xmlns:wpi="http://schemas.microsoft.com/office/word/2010/wordprocessingInk" xmlns:wne="http://schemas.microsoft.com/office/word/2006/wordml" xmlns:wps="http://schemas.microsoft.com/office/word/2010/wordprocessingShape" mc:Ignorable="w14 w15 w16se w16cid w16 w16cex w16sdtdh w16sdtfl w16du wp14">
   <w:body>
     <w:p>
       <w:pPr>
@@ -33,6 +33,7 @@
         </w:rPr>
         <w:t>&lt;&lt;</w:t>
       </w:r>
+      <w:proofErr w:type="spellStart"/>
       <w:r>
         <w:rPr>
           <w:rFonts w:ascii="Times New Roman" w:hAnsi="Times New Roman"/>
@@ -43,6 +44,7 @@
         </w:rPr>
         <w:t>serialNo</w:t>
       </w:r>
+      <w:proofErr w:type="spellEnd"/>
       <w:r>
         <w:rPr>
           <w:b/>
@@ -111,7 +113,23 @@
           <w:rFonts w:ascii="Times New Roman" w:hAnsi="Times New Roman"/>
           <w:sz w:val="24"/>
         </w:rPr>
-        <w:t>Inventor(s):     &lt;&lt;inventorEtal&gt;&gt;</w:t>
+        <w:t>Inventor(s):     &lt;&lt;</w:t>
+      </w:r>
+      <w:proofErr w:type="spellStart"/>
+      <w:r>
+        <w:rPr>
+          <w:rFonts w:ascii="Times New Roman" w:hAnsi="Times New Roman"/>
+          <w:sz w:val="24"/>
+        </w:rPr>
+        <w:t>inventorEtal</w:t>
+      </w:r>
+      <w:proofErr w:type="spellEnd"/>
+      <w:r>
+        <w:rPr>
+          <w:rFonts w:ascii="Times New Roman" w:hAnsi="Times New Roman"/>
+          <w:sz w:val="24"/>
+        </w:rPr>
+        <w:t>&gt;&gt;</w:t>
       </w:r>
       <w:r>
         <w:rPr>
@@ -132,7 +150,21 @@
         <w:rPr>
           <w:sz w:val="24"/>
         </w:rPr>
-        <w:t>&lt;&lt;examinerName&gt;&gt;</w:t>
+        <w:t>&lt;&lt;</w:t>
+      </w:r>
+      <w:proofErr w:type="spellStart"/>
+      <w:r>
+        <w:rPr>
+          <w:sz w:val="24"/>
+        </w:rPr>
+        <w:t>examinerName</w:t>
+      </w:r>
+      <w:proofErr w:type="spellEnd"/>
+      <w:r>
+        <w:rPr>
+          <w:sz w:val="24"/>
+        </w:rPr>
+        <w:t>&gt;&gt;</w:t>
       </w:r>
     </w:p>
     <w:p>
@@ -164,12 +196,14 @@
         </w:rPr>
         <w:t>&lt;&lt;</w:t>
       </w:r>
+      <w:proofErr w:type="spellStart"/>
       <w:r>
         <w:rPr>
           <w:rFonts w:ascii="Times New Roman" w:hAnsi="Times New Roman"/>
         </w:rPr>
         <w:t>serialNo</w:t>
       </w:r>
+      <w:proofErr w:type="spellEnd"/>
       <w:r>
         <w:t>&gt;&gt;</w:t>
       </w:r>
@@ -181,7 +215,15 @@
         <w:t xml:space="preserve">Group Art Unit: </w:t>
       </w:r>
       <w:r>
-        <w:t>&lt;&lt;artUnit&gt;&gt;</w:t>
+        <w:t>&lt;&lt;</w:t>
+      </w:r>
+      <w:proofErr w:type="spellStart"/>
+      <w:r>
+        <w:t>artUnit</w:t>
+      </w:r>
+      <w:proofErr w:type="spellEnd"/>
+      <w:r>
+        <w:t>&gt;&gt;</w:t>
       </w:r>
     </w:p>
     <w:p>
@@ -217,6 +259,7 @@
         </w:rPr>
         <w:t>&lt;&lt;</w:t>
       </w:r>
+      <w:proofErr w:type="spellStart"/>
       <w:r>
         <w:rPr>
           <w:rFonts w:ascii="Times New Roman" w:hAnsi="Times New Roman"/>
@@ -224,6 +267,7 @@
         </w:rPr>
         <w:t>filedDate</w:t>
       </w:r>
+      <w:proofErr w:type="spellEnd"/>
       <w:r>
         <w:rPr>
           <w:sz w:val="24"/>
@@ -245,6 +289,7 @@
         </w:rPr>
         <w:t>&lt;&lt;</w:t>
       </w:r>
+      <w:proofErr w:type="spellStart"/>
       <w:r>
         <w:rPr>
           <w:rFonts w:ascii="Times New Roman" w:hAnsi="Times New Roman"/>
@@ -252,6 +297,7 @@
         </w:rPr>
         <w:t>matterNo</w:t>
       </w:r>
+      <w:proofErr w:type="spellEnd"/>
       <w:r>
         <w:rPr>
           <w:sz w:val="24"/>
@@ -282,7 +328,21 @@
         <w:rPr>
           <w:sz w:val="24"/>
         </w:rPr>
-        <w:t>&lt;&lt;custNoCorresp&gt;&gt;</w:t>
+        <w:t>&lt;&lt;</w:t>
+      </w:r>
+      <w:proofErr w:type="spellStart"/>
+      <w:r>
+        <w:rPr>
+          <w:sz w:val="24"/>
+        </w:rPr>
+        <w:t>custNoCorresp</w:t>
+      </w:r>
+      <w:proofErr w:type="spellEnd"/>
+      <w:r>
+        <w:rPr>
+          <w:sz w:val="24"/>
+        </w:rPr>
+        <w:t>&gt;&gt;</w:t>
       </w:r>
       <w:r>
         <w:rPr>
@@ -296,7 +356,21 @@
         <w:rPr>
           <w:sz w:val="24"/>
         </w:rPr>
-        <w:t>&lt;&lt;confirmNo&gt;&gt;</w:t>
+        <w:t>&lt;&lt;</w:t>
+      </w:r>
+      <w:proofErr w:type="spellStart"/>
+      <w:r>
+        <w:rPr>
+          <w:sz w:val="24"/>
+        </w:rPr>
+        <w:t>confirmNo</w:t>
+      </w:r>
+      <w:proofErr w:type="spellEnd"/>
+      <w:r>
+        <w:rPr>
+          <w:sz w:val="24"/>
+        </w:rPr>
+        <w:t>&gt;&gt;</w:t>
       </w:r>
     </w:p>
     <w:p>
@@ -460,7 +534,23 @@
           <w:rFonts w:ascii="Times New Roman" w:hAnsi="Times New Roman"/>
           <w:sz w:val="24"/>
         </w:rPr>
-        <w:t>&lt;&lt;dueDate&gt;&gt;</w:t>
+        <w:t>&lt;&lt;</w:t>
+      </w:r>
+      <w:proofErr w:type="spellStart"/>
+      <w:r>
+        <w:rPr>
+          <w:rFonts w:ascii="Times New Roman" w:hAnsi="Times New Roman"/>
+          <w:sz w:val="24"/>
+        </w:rPr>
+        <w:t>dueDate</w:t>
+      </w:r>
+      <w:proofErr w:type="spellEnd"/>
+      <w:r>
+        <w:rPr>
+          <w:rFonts w:ascii="Times New Roman" w:hAnsi="Times New Roman"/>
+          <w:sz w:val="24"/>
+        </w:rPr>
+        <w:t>&gt;&gt;</w:t>
       </w:r>
       <w:r>
         <w:rPr>
@@ -645,7 +735,25 @@
           <w:sz w:val="22"/>
           <w:szCs w:val="22"/>
         </w:rPr>
-        <w:t>&lt;&lt;firmName&gt;&gt;</w:t>
+        <w:t>&lt;&lt;</w:t>
+      </w:r>
+      <w:proofErr w:type="spellStart"/>
+      <w:r>
+        <w:rPr>
+          <w:rFonts w:ascii="Times New Roman" w:hAnsi="Times New Roman"/>
+          <w:sz w:val="22"/>
+          <w:szCs w:val="22"/>
+        </w:rPr>
+        <w:t>firmName</w:t>
+      </w:r>
+      <w:proofErr w:type="spellEnd"/>
+      <w:r>
+        <w:rPr>
+          <w:rFonts w:ascii="Times New Roman" w:hAnsi="Times New Roman"/>
+          <w:sz w:val="22"/>
+          <w:szCs w:val="22"/>
+        </w:rPr>
+        <w:t>&gt;&gt;</w:t>
       </w:r>
     </w:p>
     <w:p>
@@ -755,6 +863,7 @@
         </w:rPr>
         <w:t>&lt;&lt;</w:t>
       </w:r>
+      <w:proofErr w:type="spellStart"/>
       <w:r>
         <w:rPr>
           <w:rFonts w:ascii="Times New Roman" w:hAnsi="Times New Roman"/>
@@ -762,6 +871,7 @@
         </w:rPr>
         <w:t>SAPhone</w:t>
       </w:r>
+      <w:proofErr w:type="spellEnd"/>
       <w:r>
         <w:rPr>
           <w:sz w:val="24"/>
@@ -809,7 +919,23 @@
           <w:rFonts w:ascii="Times New Roman" w:hAnsi="Times New Roman"/>
           <w:sz w:val="24"/>
         </w:rPr>
-        <w:t>&lt;&lt;signatureDate&gt;&gt;</w:t>
+        <w:t>&lt;&lt;</w:t>
+      </w:r>
+      <w:proofErr w:type="spellStart"/>
+      <w:r>
+        <w:rPr>
+          <w:rFonts w:ascii="Times New Roman" w:hAnsi="Times New Roman"/>
+          <w:sz w:val="24"/>
+        </w:rPr>
+        <w:t>signatureDate</w:t>
+      </w:r>
+      <w:proofErr w:type="spellEnd"/>
+      <w:r>
+        <w:rPr>
+          <w:rFonts w:ascii="Times New Roman" w:hAnsi="Times New Roman"/>
+          <w:sz w:val="24"/>
+        </w:rPr>
+        <w:t>&gt;&gt;</w:t>
       </w:r>
       <w:r>
         <w:rPr>
@@ -830,7 +956,23 @@
           <w:rFonts w:ascii="Times New Roman" w:hAnsi="Times New Roman"/>
           <w:sz w:val="24"/>
         </w:rPr>
-        <w:t>&lt;&lt;echoSignature&gt;&gt;</w:t>
+        <w:t>&lt;&lt;</w:t>
+      </w:r>
+      <w:proofErr w:type="spellStart"/>
+      <w:r>
+        <w:rPr>
+          <w:rFonts w:ascii="Times New Roman" w:hAnsi="Times New Roman"/>
+          <w:sz w:val="24"/>
+        </w:rPr>
+        <w:t>echoSignature</w:t>
+      </w:r>
+      <w:proofErr w:type="spellEnd"/>
+      <w:r>
+        <w:rPr>
+          <w:rFonts w:ascii="Times New Roman" w:hAnsi="Times New Roman"/>
+          <w:sz w:val="24"/>
+        </w:rPr>
+        <w:t>&gt;&gt;</w:t>
       </w:r>
     </w:p>
     <w:p>
@@ -898,6 +1040,7 @@
         </w:rPr>
         <w:t>&lt;&lt;</w:t>
       </w:r>
+      <w:proofErr w:type="spellStart"/>
       <w:r>
         <w:rPr>
           <w:rFonts w:ascii="Times New Roman" w:hAnsi="Times New Roman"/>
@@ -905,6 +1048,7 @@
         </w:rPr>
         <w:t>SAName</w:t>
       </w:r>
+      <w:proofErr w:type="spellEnd"/>
       <w:r>
         <w:rPr>
           <w:sz w:val="24"/>
@@ -924,14 +1068,6 @@
       </w:pPr>
       <w:r>
         <w:rPr>
-          <w:rFonts w:cs="Dutch801 Rm BT"/>
-          <w:sz w:val="18"/>
-          <w:szCs w:val="18"/>
-        </w:rPr>
-        <w:t>&lt;&lt;nickSA&gt;&gt;:CMG:&lt;&lt;nickU&gt;&gt;</w:t>
-      </w:r>
-      <w:r>
-        <w:rPr>
           <w:rFonts w:ascii="Times New Roman" w:hAnsi="Times New Roman"/>
           <w:sz w:val="24"/>
         </w:rPr>
@@ -948,7 +1084,21 @@
         <w:rPr>
           <w:sz w:val="24"/>
         </w:rPr>
-        <w:t>&lt;&lt;SARegNo&gt;&gt;</w:t>
+        <w:t>&lt;&lt;</w:t>
+      </w:r>
+      <w:proofErr w:type="spellStart"/>
+      <w:r>
+        <w:rPr>
+          <w:sz w:val="24"/>
+        </w:rPr>
+        <w:t>SARegNo</w:t>
+      </w:r>
+      <w:proofErr w:type="spellEnd"/>
+      <w:r>
+        <w:rPr>
+          <w:sz w:val="24"/>
+        </w:rPr>
+        <w:t>&gt;&gt;</w:t>
       </w:r>
     </w:p>
     <w:p>
@@ -1040,6 +1190,7 @@
           <w:lang w:val="fr-FR"/>
         </w:rPr>
       </w:pPr>
+      <w:proofErr w:type="spellStart"/>
       <w:r>
         <w:rPr>
           <w:rFonts w:ascii="Times New Roman" w:hAnsi="Times New Roman"/>
@@ -1048,6 +1199,7 @@
         </w:rPr>
         <w:t>Applicant</w:t>
       </w:r>
+      <w:proofErr w:type="spellEnd"/>
       <w:r>
         <w:rPr>
           <w:rFonts w:ascii="Times New Roman" w:hAnsi="Times New Roman"/>
@@ -1068,7 +1220,14 @@
         <w:rPr>
           <w:sz w:val="24"/>
         </w:rPr>
-        <w:t>&lt;&lt;inventorEt</w:t>
+        <w:t>&lt;&lt;</w:t>
+      </w:r>
+      <w:proofErr w:type="spellStart"/>
+      <w:r>
+        <w:rPr>
+          <w:sz w:val="24"/>
+        </w:rPr>
+        <w:t>inventorEt</w:t>
       </w:r>
       <w:r>
         <w:rPr>
@@ -1080,7 +1239,14 @@
         <w:rPr>
           <w:sz w:val="24"/>
         </w:rPr>
-        <w:t>l&gt;&gt;</w:t>
+        <w:t>l</w:t>
+      </w:r>
+      <w:proofErr w:type="spellEnd"/>
+      <w:r>
+        <w:rPr>
+          <w:sz w:val="24"/>
+        </w:rPr>
+        <w:t>&gt;&gt;</w:t>
       </w:r>
     </w:p>
     <w:p>
@@ -1146,6 +1312,7 @@
         </w:rPr>
         <w:t>&lt;&lt;</w:t>
       </w:r>
+      <w:proofErr w:type="spellStart"/>
       <w:r>
         <w:rPr>
           <w:rFonts w:ascii="Times New Roman" w:hAnsi="Times New Roman" w:cs="Times New Roman"/>
@@ -1154,6 +1321,7 @@
         </w:rPr>
         <w:t>matterNo</w:t>
       </w:r>
+      <w:proofErr w:type="spellEnd"/>
       <w:r>
         <w:rPr>
           <w:b w:val="0"/>
@@ -1184,6 +1352,7 @@
         </w:rPr>
         <w:t>&lt;&lt;</w:t>
       </w:r>
+      <w:proofErr w:type="spellStart"/>
       <w:r>
         <w:rPr>
           <w:rFonts w:ascii="Times New Roman" w:hAnsi="Times New Roman" w:cs="Times New Roman"/>
@@ -1192,6 +1361,7 @@
         </w:rPr>
         <w:t>serialNo</w:t>
       </w:r>
+      <w:proofErr w:type="spellEnd"/>
       <w:r>
         <w:rPr>
           <w:b w:val="0"/>
@@ -1232,6 +1402,7 @@
         </w:rPr>
         <w:t>&lt;&lt;</w:t>
       </w:r>
+      <w:proofErr w:type="spellStart"/>
       <w:r>
         <w:rPr>
           <w:rFonts w:ascii="Times New Roman" w:hAnsi="Times New Roman"/>
@@ -1239,6 +1410,7 @@
         </w:rPr>
         <w:t>filedDate</w:t>
       </w:r>
+      <w:proofErr w:type="spellEnd"/>
       <w:r>
         <w:rPr>
           <w:sz w:val="24"/>
@@ -1298,7 +1470,21 @@
         <w:rPr>
           <w:sz w:val="24"/>
         </w:rPr>
-        <w:t>&lt;&lt;examinerName&gt;&gt;</w:t>
+        <w:t>&lt;&lt;</w:t>
+      </w:r>
+      <w:proofErr w:type="spellStart"/>
+      <w:r>
+        <w:rPr>
+          <w:sz w:val="24"/>
+        </w:rPr>
+        <w:t>examinerName</w:t>
+      </w:r>
+      <w:proofErr w:type="spellEnd"/>
+      <w:r>
+        <w:rPr>
+          <w:sz w:val="24"/>
+        </w:rPr>
+        <w:t>&gt;&gt;</w:t>
       </w:r>
       <w:r>
         <w:rPr>
@@ -1320,7 +1506,23 @@
           <w:rFonts w:ascii="Times New Roman" w:hAnsi="Times New Roman"/>
           <w:sz w:val="24"/>
         </w:rPr>
-        <w:t>&lt;&lt;artUnit&gt;&gt;</w:t>
+        <w:t>&lt;&lt;</w:t>
+      </w:r>
+      <w:proofErr w:type="spellStart"/>
+      <w:r>
+        <w:rPr>
+          <w:rFonts w:ascii="Times New Roman" w:hAnsi="Times New Roman"/>
+          <w:sz w:val="24"/>
+        </w:rPr>
+        <w:t>artUnit</w:t>
+      </w:r>
+      <w:proofErr w:type="spellEnd"/>
+      <w:r>
+        <w:rPr>
+          <w:rFonts w:ascii="Times New Roman" w:hAnsi="Times New Roman"/>
+          <w:sz w:val="24"/>
+        </w:rPr>
+        <w:t>&gt;&gt;</w:t>
       </w:r>
     </w:p>
     <w:p>
@@ -1351,7 +1553,21 @@
         <w:rPr>
           <w:sz w:val="24"/>
         </w:rPr>
-        <w:t>&lt;&lt;custNoCorresp&gt;&gt;</w:t>
+        <w:t>&lt;&lt;</w:t>
+      </w:r>
+      <w:proofErr w:type="spellStart"/>
+      <w:r>
+        <w:rPr>
+          <w:sz w:val="24"/>
+        </w:rPr>
+        <w:t>custNoCorresp</w:t>
+      </w:r>
+      <w:proofErr w:type="spellEnd"/>
+      <w:r>
+        <w:rPr>
+          <w:sz w:val="24"/>
+        </w:rPr>
+        <w:t>&gt;&gt;</w:t>
       </w:r>
       <w:r>
         <w:rPr>
@@ -1376,7 +1592,21 @@
         <w:rPr>
           <w:sz w:val="24"/>
         </w:rPr>
-        <w:t>&lt;&lt;confirmNo&gt;&gt;</w:t>
+        <w:t>&lt;&lt;</w:t>
+      </w:r>
+      <w:proofErr w:type="spellStart"/>
+      <w:r>
+        <w:rPr>
+          <w:sz w:val="24"/>
+        </w:rPr>
+        <w:t>confirmNo</w:t>
+      </w:r>
+      <w:proofErr w:type="spellEnd"/>
+      <w:r>
+        <w:rPr>
+          <w:sz w:val="24"/>
+        </w:rPr>
+        <w:t>&gt;&gt;</w:t>
       </w:r>
     </w:p>
     <w:p>
@@ -1429,12 +1659,21 @@
           <w:lang w:val="fr-FR"/>
         </w:rPr>
       </w:pPr>
+      <w:proofErr w:type="spellStart"/>
       <w:r>
         <w:rPr>
           <w:sz w:val="24"/>
           <w:lang w:val="fr-FR"/>
         </w:rPr>
-        <w:t>P.O.Box 1450</w:t>
+        <w:t>P.O.Box</w:t>
+      </w:r>
+      <w:proofErr w:type="spellEnd"/>
+      <w:r>
+        <w:rPr>
+          <w:sz w:val="24"/>
+          <w:lang w:val="fr-FR"/>
+        </w:rPr>
+        <w:t xml:space="preserve"> 1450</w:t>
       </w:r>
     </w:p>
     <w:p>
@@ -1882,7 +2121,23 @@
           <w:rFonts w:ascii="Times New Roman" w:hAnsi="Times New Roman"/>
           <w:sz w:val="24"/>
         </w:rPr>
-        <w:t>&lt;&lt;echoSignature&gt;&gt;</w:t>
+        <w:t>&lt;&lt;</w:t>
+      </w:r>
+      <w:proofErr w:type="spellStart"/>
+      <w:r>
+        <w:rPr>
+          <w:rFonts w:ascii="Times New Roman" w:hAnsi="Times New Roman"/>
+          <w:sz w:val="24"/>
+        </w:rPr>
+        <w:t>echoSignature</w:t>
+      </w:r>
+      <w:proofErr w:type="spellEnd"/>
+      <w:r>
+        <w:rPr>
+          <w:rFonts w:ascii="Times New Roman" w:hAnsi="Times New Roman"/>
+          <w:sz w:val="24"/>
+        </w:rPr>
+        <w:t>&gt;&gt;</w:t>
       </w:r>
     </w:p>
     <w:p>
@@ -1902,7 +2157,25 @@
           <w:sz w:val="24"/>
           <w:u w:val="single"/>
         </w:rPr>
-        <w:t>&lt;&lt;firmName&gt;&gt;</w:t>
+        <w:t>&lt;&lt;</w:t>
+      </w:r>
+      <w:proofErr w:type="spellStart"/>
+      <w:r>
+        <w:rPr>
+          <w:rFonts w:ascii="Times New Roman" w:hAnsi="Times New Roman"/>
+          <w:sz w:val="24"/>
+          <w:u w:val="single"/>
+        </w:rPr>
+        <w:t>firmName</w:t>
+      </w:r>
+      <w:proofErr w:type="spellEnd"/>
+      <w:r>
+        <w:rPr>
+          <w:rFonts w:ascii="Times New Roman" w:hAnsi="Times New Roman"/>
+          <w:sz w:val="24"/>
+          <w:u w:val="single"/>
+        </w:rPr>
+        <w:t>&gt;&gt;</w:t>
       </w:r>
       <w:r>
         <w:rPr>
@@ -1956,22 +2229,37 @@
         <w:rPr>
           <w:sz w:val="24"/>
         </w:rPr>
-        <w:t>&lt;&lt;custNoCorresp&gt;&gt;</w:t>
-      </w:r>
-      <w:r>
-        <w:rPr>
-          <w:rFonts w:ascii="Times New Roman" w:hAnsi="Times New Roman"/>
-          <w:sz w:val="24"/>
-        </w:rPr>
-        <w:tab/>
-      </w:r>
-      <w:r>
-        <w:rPr>
-          <w:rFonts w:ascii="Times New Roman" w:hAnsi="Times New Roman"/>
-          <w:sz w:val="24"/>
-        </w:rPr>
         <w:t>&lt;&lt;</w:t>
       </w:r>
+      <w:proofErr w:type="spellStart"/>
+      <w:r>
+        <w:rPr>
+          <w:sz w:val="24"/>
+        </w:rPr>
+        <w:t>custNoCorresp</w:t>
+      </w:r>
+      <w:proofErr w:type="spellEnd"/>
+      <w:r>
+        <w:rPr>
+          <w:sz w:val="24"/>
+        </w:rPr>
+        <w:t>&gt;&gt;</w:t>
+      </w:r>
+      <w:r>
+        <w:rPr>
+          <w:rFonts w:ascii="Times New Roman" w:hAnsi="Times New Roman"/>
+          <w:sz w:val="24"/>
+        </w:rPr>
+        <w:tab/>
+      </w:r>
+      <w:r>
+        <w:rPr>
+          <w:rFonts w:ascii="Times New Roman" w:hAnsi="Times New Roman"/>
+          <w:sz w:val="24"/>
+        </w:rPr>
+        <w:t>&lt;&lt;</w:t>
+      </w:r>
+      <w:proofErr w:type="spellStart"/>
       <w:r>
         <w:rPr>
           <w:rFonts w:ascii="Times New Roman" w:hAnsi="Times New Roman"/>
@@ -1979,6 +2267,7 @@
         </w:rPr>
         <w:t>SAName</w:t>
       </w:r>
+      <w:proofErr w:type="spellEnd"/>
       <w:r>
         <w:rPr>
           <w:sz w:val="24"/>
@@ -1999,77 +2288,37 @@
       <w:r>
         <w:rPr>
           <w:rFonts w:ascii="Times New Roman" w:hAnsi="Times New Roman"/>
-          <w:sz w:val="18"/>
-          <w:szCs w:val="18"/>
+          <w:sz w:val="24"/>
+        </w:rPr>
+        <w:tab/>
+        <w:t>Reg.</w:t>
+      </w:r>
+      <w:r>
+        <w:rPr>
+          <w:rFonts w:ascii="Times New Roman" w:hAnsi="Times New Roman"/>
+          <w:sz w:val="24"/>
+        </w:rPr>
+        <w:t xml:space="preserve"> No. </w:t>
+      </w:r>
+      <w:r>
+        <w:rPr>
+          <w:sz w:val="24"/>
         </w:rPr>
         <w:t>&lt;&lt;</w:t>
       </w:r>
-      <w:r>
-        <w:rPr>
-          <w:rFonts w:ascii="Times New Roman" w:hAnsi="Times New Roman"/>
-          <w:sz w:val="18"/>
-          <w:szCs w:val="18"/>
-        </w:rPr>
-        <w:t>nickSA</w:t>
-      </w:r>
-      <w:r>
-        <w:rPr>
-          <w:sz w:val="18"/>
-          <w:szCs w:val="18"/>
+      <w:proofErr w:type="spellStart"/>
+      <w:r>
+        <w:rPr>
+          <w:sz w:val="24"/>
+        </w:rPr>
+        <w:t>SARegNo</w:t>
+      </w:r>
+      <w:proofErr w:type="spellEnd"/>
+      <w:r>
+        <w:rPr>
+          <w:sz w:val="24"/>
         </w:rPr>
         <w:t>&gt;&gt;</w:t>
-      </w:r>
-      <w:r>
-        <w:rPr>
-          <w:rFonts w:ascii="Times New Roman" w:hAnsi="Times New Roman"/>
-          <w:sz w:val="18"/>
-          <w:szCs w:val="18"/>
-        </w:rPr>
-        <w:t>:CMG:</w:t>
-      </w:r>
-      <w:r>
-        <w:rPr>
-          <w:rFonts w:ascii="Times New Roman" w:hAnsi="Times New Roman"/>
-          <w:sz w:val="18"/>
-          <w:szCs w:val="18"/>
-        </w:rPr>
-        <w:t xml:space="preserve"> &lt;&lt;</w:t>
-      </w:r>
-      <w:r>
-        <w:rPr>
-          <w:rFonts w:ascii="Times New Roman" w:hAnsi="Times New Roman"/>
-          <w:sz w:val="18"/>
-          <w:szCs w:val="18"/>
-        </w:rPr>
-        <w:t>nickU</w:t>
-      </w:r>
-      <w:r>
-        <w:rPr>
-          <w:sz w:val="18"/>
-          <w:szCs w:val="18"/>
-        </w:rPr>
-        <w:t>&gt;&gt;</w:t>
-      </w:r>
-      <w:r>
-        <w:rPr>
-          <w:rFonts w:ascii="Times New Roman" w:hAnsi="Times New Roman"/>
-          <w:sz w:val="24"/>
-        </w:rPr>
-        <w:tab/>
-        <w:t>Reg.</w:t>
-      </w:r>
-      <w:r>
-        <w:rPr>
-          <w:rFonts w:ascii="Times New Roman" w:hAnsi="Times New Roman"/>
-          <w:sz w:val="24"/>
-        </w:rPr>
-        <w:t xml:space="preserve"> No. </w:t>
-      </w:r>
-      <w:r>
-        <w:rPr>
-          <w:sz w:val="24"/>
-        </w:rPr>
-        <w:t>&lt;&lt;SARegNo&gt;&gt;</w:t>
       </w:r>
     </w:p>
     <w:p>
@@ -2127,7 +2376,7 @@
 </file>
 
 <file path=word/endnotes.xml><?xml version="1.0" encoding="utf-8"?>
-<w:endnotes xmlns:wpc="http://schemas.microsoft.com/office/word/2010/wordprocessingCanvas" xmlns:cx="http://schemas.microsoft.com/office/drawing/2014/chartex" xmlns:cx1="http://schemas.microsoft.com/office/drawing/2015/9/8/chartex" xmlns:cx2="http://schemas.microsoft.com/office/drawing/2015/10/21/chartex" xmlns:cx3="http://schemas.microsoft.com/office/drawing/2016/5/9/chartex" xmlns:cx4="http://schemas.microsoft.com/office/drawing/2016/5/10/chartex" xmlns:cx5="http://schemas.microsoft.com/office/drawing/2016/5/11/chartex" xmlns:cx6="http://schemas.microsoft.com/office/drawing/2016/5/12/chartex" xmlns:cx7="http://schemas.microsoft.com/office/drawing/2016/5/13/chartex" xmlns:cx8="http://schemas.microsoft.com/office/drawing/2016/5/14/chartex" xmlns:mc="http://schemas.openxmlformats.org/markup-compatibility/2006" xmlns:aink="http://schemas.microsoft.com/office/drawing/2016/ink" xmlns:am3d="http://schemas.microsoft.com/office/drawing/2017/model3d" xmlns:o="urn:schemas-microsoft-com:office:office" xmlns:oel="http://schemas.microsoft.com/office/2019/extlst" xmlns:r="http://schemas.openxmlformats.org/officeDocument/2006/relationships" xmlns:m="http://schemas.openxmlformats.org/officeDocument/2006/math" xmlns:v="urn:schemas-microsoft-com:vml" xmlns:wp14="http://schemas.microsoft.com/office/word/2010/wordprocessingDrawing" xmlns:wp="http://schemas.openxmlformats.org/drawingml/2006/wordprocessingDrawing" xmlns:w10="urn:schemas-microsoft-com:office:word" xmlns:w="http://schemas.openxmlformats.org/wordprocessingml/2006/main" xmlns:w14="http://schemas.microsoft.com/office/word/2010/wordml" xmlns:w15="http://schemas.microsoft.com/office/word/2012/wordml" xmlns:w16cex="http://schemas.microsoft.com/office/word/2018/wordml/cex" xmlns:w16cid="http://schemas.microsoft.com/office/word/2016/wordml/cid" xmlns:w16="http://schemas.microsoft.com/office/word/2018/wordml" xmlns:w16sdtdh="http://schemas.microsoft.com/office/word/2020/wordml/sdtdatahash" xmlns:w16se="http://schemas.microsoft.com/office/word/2015/wordml/symex" xmlns:wpg="http://schemas.microsoft.com/office/word/2010/wordprocessingGroup" xmlns:wpi="http://schemas.microsoft.com/office/word/2010/wordprocessingInk" xmlns:wne="http://schemas.microsoft.com/office/word/2006/wordml" xmlns:wps="http://schemas.microsoft.com/office/word/2010/wordprocessingShape" mc:Ignorable="w14 w15 w16se w16cid w16 w16cex w16sdtdh wp14">
+<w:endnotes xmlns:wpc="http://schemas.microsoft.com/office/word/2010/wordprocessingCanvas" xmlns:cx="http://schemas.microsoft.com/office/drawing/2014/chartex" xmlns:cx1="http://schemas.microsoft.com/office/drawing/2015/9/8/chartex" xmlns:cx2="http://schemas.microsoft.com/office/drawing/2015/10/21/chartex" xmlns:cx3="http://schemas.microsoft.com/office/drawing/2016/5/9/chartex" xmlns:cx4="http://schemas.microsoft.com/office/drawing/2016/5/10/chartex" xmlns:cx5="http://schemas.microsoft.com/office/drawing/2016/5/11/chartex" xmlns:cx6="http://schemas.microsoft.com/office/drawing/2016/5/12/chartex" xmlns:cx7="http://schemas.microsoft.com/office/drawing/2016/5/13/chartex" xmlns:cx8="http://schemas.microsoft.com/office/drawing/2016/5/14/chartex" xmlns:mc="http://schemas.openxmlformats.org/markup-compatibility/2006" xmlns:aink="http://schemas.microsoft.com/office/drawing/2016/ink" xmlns:am3d="http://schemas.microsoft.com/office/drawing/2017/model3d" xmlns:o="urn:schemas-microsoft-com:office:office" xmlns:oel="http://schemas.microsoft.com/office/2019/extlst" xmlns:r="http://schemas.openxmlformats.org/officeDocument/2006/relationships" xmlns:m="http://schemas.openxmlformats.org/officeDocument/2006/math" xmlns:v="urn:schemas-microsoft-com:vml" xmlns:wp14="http://schemas.microsoft.com/office/word/2010/wordprocessingDrawing" xmlns:wp="http://schemas.openxmlformats.org/drawingml/2006/wordprocessingDrawing" xmlns:w10="urn:schemas-microsoft-com:office:word" xmlns:w="http://schemas.openxmlformats.org/wordprocessingml/2006/main" xmlns:w14="http://schemas.microsoft.com/office/word/2010/wordml" xmlns:w15="http://schemas.microsoft.com/office/word/2012/wordml" xmlns:w16cex="http://schemas.microsoft.com/office/word/2018/wordml/cex" xmlns:w16cid="http://schemas.microsoft.com/office/word/2016/wordml/cid" xmlns:w16="http://schemas.microsoft.com/office/word/2018/wordml" xmlns:w16du="http://schemas.microsoft.com/office/word/2023/wordml/word16du" xmlns:w16sdtdh="http://schemas.microsoft.com/office/word/2020/wordml/sdtdatahash" xmlns:w16sdtfl="http://schemas.microsoft.com/office/word/2024/wordml/sdtformatlock" xmlns:w16se="http://schemas.microsoft.com/office/word/2015/wordml/symex" xmlns:wpg="http://schemas.microsoft.com/office/word/2010/wordprocessingGroup" xmlns:wpi="http://schemas.microsoft.com/office/word/2010/wordprocessingInk" xmlns:wne="http://schemas.microsoft.com/office/word/2006/wordml" xmlns:wps="http://schemas.microsoft.com/office/word/2010/wordprocessingShape" mc:Ignorable="w14 w15 w16se w16cid w16 w16cex w16sdtdh w16sdtfl w16du wp14">
   <w:endnote w:type="separator" w:id="-1">
     <w:p>
       <w:r>
@@ -2146,7 +2395,7 @@
 </file>
 
 <file path=word/footer1.xml><?xml version="1.0" encoding="utf-8"?>
-<w:ftr xmlns:wpc="http://schemas.microsoft.com/office/word/2010/wordprocessingCanvas" xmlns:cx="http://schemas.microsoft.com/office/drawing/2014/chartex" xmlns:cx1="http://schemas.microsoft.com/office/drawing/2015/9/8/chartex" xmlns:cx2="http://schemas.microsoft.com/office/drawing/2015/10/21/chartex" xmlns:cx3="http://schemas.microsoft.com/office/drawing/2016/5/9/chartex" xmlns:cx4="http://schemas.microsoft.com/office/drawing/2016/5/10/chartex" xmlns:cx5="http://schemas.microsoft.com/office/drawing/2016/5/11/chartex" xmlns:cx6="http://schemas.microsoft.com/office/drawing/2016/5/12/chartex" xmlns:cx7="http://schemas.microsoft.com/office/drawing/2016/5/13/chartex" xmlns:cx8="http://schemas.microsoft.com/office/drawing/2016/5/14/chartex" xmlns:mc="http://schemas.openxmlformats.org/markup-compatibility/2006" xmlns:aink="http://schemas.microsoft.com/office/drawing/2016/ink" xmlns:am3d="http://schemas.microsoft.com/office/drawing/2017/model3d" xmlns:o="urn:schemas-microsoft-com:office:office" xmlns:oel="http://schemas.microsoft.com/office/2019/extlst" xmlns:r="http://schemas.openxmlformats.org/officeDocument/2006/relationships" xmlns:m="http://schemas.openxmlformats.org/officeDocument/2006/math" xmlns:v="urn:schemas-microsoft-com:vml" xmlns:wp14="http://schemas.microsoft.com/office/word/2010/wordprocessingDrawing" xmlns:wp="http://schemas.openxmlformats.org/drawingml/2006/wordprocessingDrawing" xmlns:w10="urn:schemas-microsoft-com:office:word" xmlns:w="http://schemas.openxmlformats.org/wordprocessingml/2006/main" xmlns:w14="http://schemas.microsoft.com/office/word/2010/wordml" xmlns:w15="http://schemas.microsoft.com/office/word/2012/wordml" xmlns:w16cex="http://schemas.microsoft.com/office/word/2018/wordml/cex" xmlns:w16cid="http://schemas.microsoft.com/office/word/2016/wordml/cid" xmlns:w16="http://schemas.microsoft.com/office/word/2018/wordml" xmlns:w16sdtdh="http://schemas.microsoft.com/office/word/2020/wordml/sdtdatahash" xmlns:w16se="http://schemas.microsoft.com/office/word/2015/wordml/symex" xmlns:wpg="http://schemas.microsoft.com/office/word/2010/wordprocessingGroup" xmlns:wpi="http://schemas.microsoft.com/office/word/2010/wordprocessingInk" xmlns:wne="http://schemas.microsoft.com/office/word/2006/wordml" xmlns:wps="http://schemas.microsoft.com/office/word/2010/wordprocessingShape" mc:Ignorable="w14 w15 w16se w16cid w16 w16cex w16sdtdh wp14">
+<w:ftr xmlns:wpc="http://schemas.microsoft.com/office/word/2010/wordprocessingCanvas" xmlns:cx="http://schemas.microsoft.com/office/drawing/2014/chartex" xmlns:cx1="http://schemas.microsoft.com/office/drawing/2015/9/8/chartex" xmlns:cx2="http://schemas.microsoft.com/office/drawing/2015/10/21/chartex" xmlns:cx3="http://schemas.microsoft.com/office/drawing/2016/5/9/chartex" xmlns:cx4="http://schemas.microsoft.com/office/drawing/2016/5/10/chartex" xmlns:cx5="http://schemas.microsoft.com/office/drawing/2016/5/11/chartex" xmlns:cx6="http://schemas.microsoft.com/office/drawing/2016/5/12/chartex" xmlns:cx7="http://schemas.microsoft.com/office/drawing/2016/5/13/chartex" xmlns:cx8="http://schemas.microsoft.com/office/drawing/2016/5/14/chartex" xmlns:mc="http://schemas.openxmlformats.org/markup-compatibility/2006" xmlns:aink="http://schemas.microsoft.com/office/drawing/2016/ink" xmlns:am3d="http://schemas.microsoft.com/office/drawing/2017/model3d" xmlns:o="urn:schemas-microsoft-com:office:office" xmlns:oel="http://schemas.microsoft.com/office/2019/extlst" xmlns:r="http://schemas.openxmlformats.org/officeDocument/2006/relationships" xmlns:m="http://schemas.openxmlformats.org/officeDocument/2006/math" xmlns:v="urn:schemas-microsoft-com:vml" xmlns:wp14="http://schemas.microsoft.com/office/word/2010/wordprocessingDrawing" xmlns:wp="http://schemas.openxmlformats.org/drawingml/2006/wordprocessingDrawing" xmlns:w10="urn:schemas-microsoft-com:office:word" xmlns:w="http://schemas.openxmlformats.org/wordprocessingml/2006/main" xmlns:w14="http://schemas.microsoft.com/office/word/2010/wordml" xmlns:w15="http://schemas.microsoft.com/office/word/2012/wordml" xmlns:w16cex="http://schemas.microsoft.com/office/word/2018/wordml/cex" xmlns:w16cid="http://schemas.microsoft.com/office/word/2016/wordml/cid" xmlns:w16="http://schemas.microsoft.com/office/word/2018/wordml" xmlns:w16du="http://schemas.microsoft.com/office/word/2023/wordml/word16du" xmlns:w16sdtdh="http://schemas.microsoft.com/office/word/2020/wordml/sdtdatahash" xmlns:w16sdtfl="http://schemas.microsoft.com/office/word/2024/wordml/sdtformatlock" xmlns:w16se="http://schemas.microsoft.com/office/word/2015/wordml/symex" xmlns:wpg="http://schemas.microsoft.com/office/word/2010/wordprocessingGroup" xmlns:wpi="http://schemas.microsoft.com/office/word/2010/wordprocessingInk" xmlns:wne="http://schemas.microsoft.com/office/word/2006/wordml" xmlns:wps="http://schemas.microsoft.com/office/word/2010/wordprocessingShape" mc:Ignorable="w14 w15 w16se w16cid w16 w16cex w16sdtdh w16sdtfl w16du wp14">
   <w:p>
     <w:pPr>
       <w:pStyle w:val="Footer"/>
@@ -2156,7 +2405,7 @@
 </file>
 
 <file path=word/footnotes.xml><?xml version="1.0" encoding="utf-8"?>
-<w:footnotes xmlns:wpc="http://schemas.microsoft.com/office/word/2010/wordprocessingCanvas" xmlns:cx="http://schemas.microsoft.com/office/drawing/2014/chartex" xmlns:cx1="http://schemas.microsoft.com/office/drawing/2015/9/8/chartex" xmlns:cx2="http://schemas.microsoft.com/office/drawing/2015/10/21/chartex" xmlns:cx3="http://schemas.microsoft.com/office/drawing/2016/5/9/chartex" xmlns:cx4="http://schemas.microsoft.com/office/drawing/2016/5/10/chartex" xmlns:cx5="http://schemas.microsoft.com/office/drawing/2016/5/11/chartex" xmlns:cx6="http://schemas.microsoft.com/office/drawing/2016/5/12/chartex" xmlns:cx7="http://schemas.microsoft.com/office/drawing/2016/5/13/chartex" xmlns:cx8="http://schemas.microsoft.com/office/drawing/2016/5/14/chartex" xmlns:mc="http://schemas.openxmlformats.org/markup-compatibility/2006" xmlns:aink="http://schemas.microsoft.com/office/drawing/2016/ink" xmlns:am3d="http://schemas.microsoft.com/office/drawing/2017/model3d" xmlns:o="urn:schemas-microsoft-com:office:office" xmlns:oel="http://schemas.microsoft.com/office/2019/extlst" xmlns:r="http://schemas.openxmlformats.org/officeDocument/2006/relationships" xmlns:m="http://schemas.openxmlformats.org/officeDocument/2006/math" xmlns:v="urn:schemas-microsoft-com:vml" xmlns:wp14="http://schemas.microsoft.com/office/word/2010/wordprocessingDrawing" xmlns:wp="http://schemas.openxmlformats.org/drawingml/2006/wordprocessingDrawing" xmlns:w10="urn:schemas-microsoft-com:office:word" xmlns:w="http://schemas.openxmlformats.org/wordprocessingml/2006/main" xmlns:w14="http://schemas.microsoft.com/office/word/2010/wordml" xmlns:w15="http://schemas.microsoft.com/office/word/2012/wordml" xmlns:w16cex="http://schemas.microsoft.com/office/word/2018/wordml/cex" xmlns:w16cid="http://schemas.microsoft.com/office/word/2016/wordml/cid" xmlns:w16="http://schemas.microsoft.com/office/word/2018/wordml" xmlns:w16sdtdh="http://schemas.microsoft.com/office/word/2020/wordml/sdtdatahash" xmlns:w16se="http://schemas.microsoft.com/office/word/2015/wordml/symex" xmlns:wpg="http://schemas.microsoft.com/office/word/2010/wordprocessingGroup" xmlns:wpi="http://schemas.microsoft.com/office/word/2010/wordprocessingInk" xmlns:wne="http://schemas.microsoft.com/office/word/2006/wordml" xmlns:wps="http://schemas.microsoft.com/office/word/2010/wordprocessingShape" mc:Ignorable="w14 w15 w16se w16cid w16 w16cex w16sdtdh wp14">
+<w:footnotes xmlns:wpc="http://schemas.microsoft.com/office/word/2010/wordprocessingCanvas" xmlns:cx="http://schemas.microsoft.com/office/drawing/2014/chartex" xmlns:cx1="http://schemas.microsoft.com/office/drawing/2015/9/8/chartex" xmlns:cx2="http://schemas.microsoft.com/office/drawing/2015/10/21/chartex" xmlns:cx3="http://schemas.microsoft.com/office/drawing/2016/5/9/chartex" xmlns:cx4="http://schemas.microsoft.com/office/drawing/2016/5/10/chartex" xmlns:cx5="http://schemas.microsoft.com/office/drawing/2016/5/11/chartex" xmlns:cx6="http://schemas.microsoft.com/office/drawing/2016/5/12/chartex" xmlns:cx7="http://schemas.microsoft.com/office/drawing/2016/5/13/chartex" xmlns:cx8="http://schemas.microsoft.com/office/drawing/2016/5/14/chartex" xmlns:mc="http://schemas.openxmlformats.org/markup-compatibility/2006" xmlns:aink="http://schemas.microsoft.com/office/drawing/2016/ink" xmlns:am3d="http://schemas.microsoft.com/office/drawing/2017/model3d" xmlns:o="urn:schemas-microsoft-com:office:office" xmlns:oel="http://schemas.microsoft.com/office/2019/extlst" xmlns:r="http://schemas.openxmlformats.org/officeDocument/2006/relationships" xmlns:m="http://schemas.openxmlformats.org/officeDocument/2006/math" xmlns:v="urn:schemas-microsoft-com:vml" xmlns:wp14="http://schemas.microsoft.com/office/word/2010/wordprocessingDrawing" xmlns:wp="http://schemas.openxmlformats.org/drawingml/2006/wordprocessingDrawing" xmlns:w10="urn:schemas-microsoft-com:office:word" xmlns:w="http://schemas.openxmlformats.org/wordprocessingml/2006/main" xmlns:w14="http://schemas.microsoft.com/office/word/2010/wordml" xmlns:w15="http://schemas.microsoft.com/office/word/2012/wordml" xmlns:w16cex="http://schemas.microsoft.com/office/word/2018/wordml/cex" xmlns:w16cid="http://schemas.microsoft.com/office/word/2016/wordml/cid" xmlns:w16="http://schemas.microsoft.com/office/word/2018/wordml" xmlns:w16du="http://schemas.microsoft.com/office/word/2023/wordml/word16du" xmlns:w16sdtdh="http://schemas.microsoft.com/office/word/2020/wordml/sdtdatahash" xmlns:w16sdtfl="http://schemas.microsoft.com/office/word/2024/wordml/sdtformatlock" xmlns:w16se="http://schemas.microsoft.com/office/word/2015/wordml/symex" xmlns:wpg="http://schemas.microsoft.com/office/word/2010/wordprocessingGroup" xmlns:wpi="http://schemas.microsoft.com/office/word/2010/wordprocessingInk" xmlns:wne="http://schemas.microsoft.com/office/word/2006/wordml" xmlns:wps="http://schemas.microsoft.com/office/word/2010/wordprocessingShape" mc:Ignorable="w14 w15 w16se w16cid w16 w16cex w16sdtdh w16sdtfl w16du wp14">
   <w:footnote w:type="separator" w:id="-1">
     <w:p>
       <w:r>
@@ -2175,7 +2424,7 @@
 </file>
 
 <file path=word/header1.xml><?xml version="1.0" encoding="utf-8"?>
-<w:hdr xmlns:wpc="http://schemas.microsoft.com/office/word/2010/wordprocessingCanvas" xmlns:cx="http://schemas.microsoft.com/office/drawing/2014/chartex" xmlns:cx1="http://schemas.microsoft.com/office/drawing/2015/9/8/chartex" xmlns:cx2="http://schemas.microsoft.com/office/drawing/2015/10/21/chartex" xmlns:cx3="http://schemas.microsoft.com/office/drawing/2016/5/9/chartex" xmlns:cx4="http://schemas.microsoft.com/office/drawing/2016/5/10/chartex" xmlns:cx5="http://schemas.microsoft.com/office/drawing/2016/5/11/chartex" xmlns:cx6="http://schemas.microsoft.com/office/drawing/2016/5/12/chartex" xmlns:cx7="http://schemas.microsoft.com/office/drawing/2016/5/13/chartex" xmlns:cx8="http://schemas.microsoft.com/office/drawing/2016/5/14/chartex" xmlns:mc="http://schemas.openxmlformats.org/markup-compatibility/2006" xmlns:aink="http://schemas.microsoft.com/office/drawing/2016/ink" xmlns:am3d="http://schemas.microsoft.com/office/drawing/2017/model3d" xmlns:o="urn:schemas-microsoft-com:office:office" xmlns:oel="http://schemas.microsoft.com/office/2019/extlst" xmlns:r="http://schemas.openxmlformats.org/officeDocument/2006/relationships" xmlns:m="http://schemas.openxmlformats.org/officeDocument/2006/math" xmlns:v="urn:schemas-microsoft-com:vml" xmlns:wp14="http://schemas.microsoft.com/office/word/2010/wordprocessingDrawing" xmlns:wp="http://schemas.openxmlformats.org/drawingml/2006/wordprocessingDrawing" xmlns:w10="urn:schemas-microsoft-com:office:word" xmlns:w="http://schemas.openxmlformats.org/wordprocessingml/2006/main" xmlns:w14="http://schemas.microsoft.com/office/word/2010/wordml" xmlns:w15="http://schemas.microsoft.com/office/word/2012/wordml" xmlns:w16cex="http://schemas.microsoft.com/office/word/2018/wordml/cex" xmlns:w16cid="http://schemas.microsoft.com/office/word/2016/wordml/cid" xmlns:w16="http://schemas.microsoft.com/office/word/2018/wordml" xmlns:w16sdtdh="http://schemas.microsoft.com/office/word/2020/wordml/sdtdatahash" xmlns:w16se="http://schemas.microsoft.com/office/word/2015/wordml/symex" xmlns:wpg="http://schemas.microsoft.com/office/word/2010/wordprocessingGroup" xmlns:wpi="http://schemas.microsoft.com/office/word/2010/wordprocessingInk" xmlns:wne="http://schemas.microsoft.com/office/word/2006/wordml" xmlns:wps="http://schemas.microsoft.com/office/word/2010/wordprocessingShape" mc:Ignorable="w14 w15 w16se w16cid w16 w16cex w16sdtdh wp14">
+<w:hdr xmlns:wpc="http://schemas.microsoft.com/office/word/2010/wordprocessingCanvas" xmlns:cx="http://schemas.microsoft.com/office/drawing/2014/chartex" xmlns:cx1="http://schemas.microsoft.com/office/drawing/2015/9/8/chartex" xmlns:cx2="http://schemas.microsoft.com/office/drawing/2015/10/21/chartex" xmlns:cx3="http://schemas.microsoft.com/office/drawing/2016/5/9/chartex" xmlns:cx4="http://schemas.microsoft.com/office/drawing/2016/5/10/chartex" xmlns:cx5="http://schemas.microsoft.com/office/drawing/2016/5/11/chartex" xmlns:cx6="http://schemas.microsoft.com/office/drawing/2016/5/12/chartex" xmlns:cx7="http://schemas.microsoft.com/office/drawing/2016/5/13/chartex" xmlns:cx8="http://schemas.microsoft.com/office/drawing/2016/5/14/chartex" xmlns:mc="http://schemas.openxmlformats.org/markup-compatibility/2006" xmlns:aink="http://schemas.microsoft.com/office/drawing/2016/ink" xmlns:am3d="http://schemas.microsoft.com/office/drawing/2017/model3d" xmlns:o="urn:schemas-microsoft-com:office:office" xmlns:oel="http://schemas.microsoft.com/office/2019/extlst" xmlns:r="http://schemas.openxmlformats.org/officeDocument/2006/relationships" xmlns:m="http://schemas.openxmlformats.org/officeDocument/2006/math" xmlns:v="urn:schemas-microsoft-com:vml" xmlns:wp14="http://schemas.microsoft.com/office/word/2010/wordprocessingDrawing" xmlns:wp="http://schemas.openxmlformats.org/drawingml/2006/wordprocessingDrawing" xmlns:w10="urn:schemas-microsoft-com:office:word" xmlns:w="http://schemas.openxmlformats.org/wordprocessingml/2006/main" xmlns:w14="http://schemas.microsoft.com/office/word/2010/wordml" xmlns:w15="http://schemas.microsoft.com/office/word/2012/wordml" xmlns:w16cex="http://schemas.microsoft.com/office/word/2018/wordml/cex" xmlns:w16cid="http://schemas.microsoft.com/office/word/2016/wordml/cid" xmlns:w16="http://schemas.microsoft.com/office/word/2018/wordml" xmlns:w16du="http://schemas.microsoft.com/office/word/2023/wordml/word16du" xmlns:w16sdtdh="http://schemas.microsoft.com/office/word/2020/wordml/sdtdatahash" xmlns:w16sdtfl="http://schemas.microsoft.com/office/word/2024/wordml/sdtformatlock" xmlns:w16se="http://schemas.microsoft.com/office/word/2015/wordml/symex" xmlns:wpg="http://schemas.microsoft.com/office/word/2010/wordprocessingGroup" xmlns:wpi="http://schemas.microsoft.com/office/word/2010/wordprocessingInk" xmlns:wne="http://schemas.microsoft.com/office/word/2006/wordml" xmlns:wps="http://schemas.microsoft.com/office/word/2010/wordprocessingShape" mc:Ignorable="w14 w15 w16se w16cid w16 w16cex w16sdtdh w16sdtfl w16du wp14">
   <w:p>
     <w:pPr>
       <w:pStyle w:val="Header"/>
@@ -2185,7 +2434,7 @@
 </file>
 
 <file path=word/styles.xml><?xml version="1.0" encoding="utf-8"?>
-<w:styles xmlns:mc="http://schemas.openxmlformats.org/markup-compatibility/2006" xmlns:r="http://schemas.openxmlformats.org/officeDocument/2006/relationships" xmlns:w="http://schemas.openxmlformats.org/wordprocessingml/2006/main" xmlns:w14="http://schemas.microsoft.com/office/word/2010/wordml" xmlns:w15="http://schemas.microsoft.com/office/word/2012/wordml" xmlns:w16cex="http://schemas.microsoft.com/office/word/2018/wordml/cex" xmlns:w16cid="http://schemas.microsoft.com/office/word/2016/wordml/cid" xmlns:w16="http://schemas.microsoft.com/office/word/2018/wordml" xmlns:w16sdtdh="http://schemas.microsoft.com/office/word/2020/wordml/sdtdatahash" xmlns:w16se="http://schemas.microsoft.com/office/word/2015/wordml/symex" mc:Ignorable="w14 w15 w16se w16cid w16 w16cex w16sdtdh">
+<w:styles xmlns:mc="http://schemas.openxmlformats.org/markup-compatibility/2006" xmlns:r="http://schemas.openxmlformats.org/officeDocument/2006/relationships" xmlns:w="http://schemas.openxmlformats.org/wordprocessingml/2006/main" xmlns:w14="http://schemas.microsoft.com/office/word/2010/wordml" xmlns:w15="http://schemas.microsoft.com/office/word/2012/wordml" xmlns:w16cex="http://schemas.microsoft.com/office/word/2018/wordml/cex" xmlns:w16cid="http://schemas.microsoft.com/office/word/2016/wordml/cid" xmlns:w16="http://schemas.microsoft.com/office/word/2018/wordml" xmlns:w16du="http://schemas.microsoft.com/office/word/2023/wordml/word16du" xmlns:w16sdtdh="http://schemas.microsoft.com/office/word/2020/wordml/sdtdatahash" xmlns:w16sdtfl="http://schemas.microsoft.com/office/word/2024/wordml/sdtformatlock" xmlns:w16se="http://schemas.microsoft.com/office/word/2015/wordml/symex" mc:Ignorable="w14 w15 w16se w16cid w16 w16cex w16sdtdh w16sdtfl w16du">
   <w:docDefaults>
     <w:rPrDefault>
       <w:rPr>

</xml_diff>